<commit_message>
Revise Kelompok 5 cryptography assignment
Update group identity, clean duplicate README sections, align ElGamal k-range documentation, and refresh Diffie-Hellman screenshots and report.

Co-authored-by: Copilot <223556219+Copilot@users.noreply.github.com>
</commit_message>
<xml_diff>
--- a/Laporan_Tugas_Diffie_Hellman_dan_ElGamal.docx
+++ b/Laporan_Tugas_Diffie_Hellman_dan_ElGamal.docx
@@ -48,7 +48,21 @@
           <w:b/>
           <w:sz w:val="24"/>
         </w:rPr>
-        <w:t>Disusun Oleh Kelompok:</w:t>
+        <w:t>Disusun Oleh Kelompok 5:</w:t>
+      </w:r>
+    </w:p>
+    <w:p>
+      <w:pPr>
+        <w:spacing w:after="280"/>
+        <w:jc w:val="center"/>
+      </w:pPr>
+      <w:r>
+        <w:rPr>
+          <w:rFonts w:ascii="Times New Roman" w:hAnsi="Times New Roman"/>
+          <w:b/>
+          <w:sz w:val="21"/>
+        </w:rPr>
+        <w:t>Kelompok 5: Putu Yudi Nandanjaya Wiraguna, Raihan Fahri Ghazali, I Gede Bagus Saka Sinatrya</w:t>
       </w:r>
     </w:p>
     <w:tbl>
@@ -1230,7 +1244,7 @@
           <w:rFonts w:ascii="Times New Roman" w:hAnsi="Times New Roman"/>
           <w:sz w:val="23"/>
         </w:rPr>
-        <w:t>Bob memilih bilangan acak sementara (ephemeral key) k yang memenuhi 1 &lt;= k &lt;= p - 2.</w:t>
+        <w:t>Bob memilih bilangan acak sementara (ephemeral key) k. Jika dipilih otomatis, program menggunakan rentang 2 &lt;= k &lt;= p - 2; validasi untuk nilai k yang ditentukan manual menerima 1 &lt;= k &lt;= p - 2.</w:t>
       </w:r>
     </w:p>
     <w:p>
@@ -3819,7 +3833,7 @@
               <w:br/>
               <w:t>3. Validasi pesan numerik m memenuhi syarat 0 &lt;= m &lt; p</w:t>
               <w:br/>
-              <w:t>4. Pilih bilangan acak sementara k pada rentang 1 &lt;= k &lt;= p-2</w:t>
+              <w:t>4. Jika otomatis, pilih k acak 2 &lt;= k &lt;= p-2; jika manual, validasi 1 &lt;= k &lt;= p-2</w:t>
               <w:br/>
               <w:t>5. Enkripsi komponen 1 : c1 &lt;- SquareAndMultiply(g, k, p)</w:t>
               <w:br/>

</xml_diff>